<commit_message>
docs: capture and embed live app screenshots in report & presentation
Add Playwright screenshot capture script. Embed 11 app screenshots into Project_Report.docx and add 11 screenshot slides + demo divider to the presentation (now 32 slides).

Co-authored-by: Cursor <cursoragent@cursor.com>
</commit_message>
<xml_diff>
--- a/docs/Project_Report.docx
+++ b/docs/Project_Report.docx
@@ -631,7 +631,7 @@
     </w:p>
     <w:p>
       <w:r>
-        <w:t>Insert screenshots of the running application below. Recommended pages to capture (from your live site):</w:t>
+        <w:t>The following screenshots were captured from the running BistroSaaS application and demonstrate its main features and pages.</w:t>
       </w:r>
     </w:p>
     <w:p>
@@ -647,18 +647,47 @@
         <w:jc w:val="center"/>
       </w:pPr>
       <w:r>
-        <w:rPr>
-          <w:i/>
-        </w:rPr>
-        <w:t>[ Paste screenshot here ]</w:t>
+        <w:drawing>
+          <wp:inline xmlns:a="http://schemas.openxmlformats.org/drawingml/2006/main" xmlns:pic="http://schemas.openxmlformats.org/drawingml/2006/picture">
+            <wp:extent cx="5669280" cy="3735250"/>
+            <wp:docPr id="2" name="Picture 2"/>
+            <wp:cNvGraphicFramePr>
+              <a:graphicFrameLocks noChangeAspect="1"/>
+            </wp:cNvGraphicFramePr>
+            <a:graphic>
+              <a:graphicData uri="http://schemas.openxmlformats.org/drawingml/2006/picture">
+                <pic:pic>
+                  <pic:nvPicPr>
+                    <pic:cNvPr id="0" name="01_menu_page.png"/>
+                    <pic:cNvPicPr/>
+                  </pic:nvPicPr>
+                  <pic:blipFill>
+                    <a:blip r:embed="rId10"/>
+                    <a:stretch>
+                      <a:fillRect/>
+                    </a:stretch>
+                  </pic:blipFill>
+                  <pic:spPr>
+                    <a:xfrm>
+                      <a:off x="0" y="0"/>
+                      <a:ext cx="5669280" cy="3735250"/>
+                    </a:xfrm>
+                    <a:prstGeom prst="rect"/>
+                  </pic:spPr>
+                </pic:pic>
+              </a:graphicData>
+            </a:graphic>
+          </wp:inline>
+        </w:drawing>
       </w:r>
     </w:p>
+    <w:p/>
     <w:p>
       <w:r>
         <w:rPr>
           <w:b/>
         </w:rPr>
-        <w:t>Screenshot 2: Registration page (showing the Role dropdown and Secret Key)</w:t>
+        <w:t>Screenshot 2: Registration page (Role dropdown and Secret Key)</w:t>
       </w:r>
     </w:p>
     <w:p>
@@ -666,12 +695,41 @@
         <w:jc w:val="center"/>
       </w:pPr>
       <w:r>
-        <w:rPr>
-          <w:i/>
-        </w:rPr>
-        <w:t>[ Paste screenshot here ]</w:t>
+        <w:drawing>
+          <wp:inline xmlns:a="http://schemas.openxmlformats.org/drawingml/2006/main" xmlns:pic="http://schemas.openxmlformats.org/drawingml/2006/picture">
+            <wp:extent cx="5669280" cy="3863909"/>
+            <wp:docPr id="3" name="Picture 3"/>
+            <wp:cNvGraphicFramePr>
+              <a:graphicFrameLocks noChangeAspect="1"/>
+            </wp:cNvGraphicFramePr>
+            <a:graphic>
+              <a:graphicData uri="http://schemas.openxmlformats.org/drawingml/2006/picture">
+                <pic:pic>
+                  <pic:nvPicPr>
+                    <pic:cNvPr id="0" name="02_register.png"/>
+                    <pic:cNvPicPr/>
+                  </pic:nvPicPr>
+                  <pic:blipFill>
+                    <a:blip r:embed="rId11"/>
+                    <a:stretch>
+                      <a:fillRect/>
+                    </a:stretch>
+                  </pic:blipFill>
+                  <pic:spPr>
+                    <a:xfrm>
+                      <a:off x="0" y="0"/>
+                      <a:ext cx="5669280" cy="3863909"/>
+                    </a:xfrm>
+                    <a:prstGeom prst="rect"/>
+                  </pic:spPr>
+                </pic:pic>
+              </a:graphicData>
+            </a:graphic>
+          </wp:inline>
+        </w:drawing>
       </w:r>
     </w:p>
+    <w:p/>
     <w:p>
       <w:r>
         <w:rPr>
@@ -685,12 +743,41 @@
         <w:jc w:val="center"/>
       </w:pPr>
       <w:r>
-        <w:rPr>
-          <w:i/>
-        </w:rPr>
-        <w:t>[ Paste screenshot here ]</w:t>
+        <w:drawing>
+          <wp:inline xmlns:a="http://schemas.openxmlformats.org/drawingml/2006/main" xmlns:pic="http://schemas.openxmlformats.org/drawingml/2006/picture">
+            <wp:extent cx="5669280" cy="3735250"/>
+            <wp:docPr id="4" name="Picture 4"/>
+            <wp:cNvGraphicFramePr>
+              <a:graphicFrameLocks noChangeAspect="1"/>
+            </wp:cNvGraphicFramePr>
+            <a:graphic>
+              <a:graphicData uri="http://schemas.openxmlformats.org/drawingml/2006/picture">
+                <pic:pic>
+                  <pic:nvPicPr>
+                    <pic:cNvPr id="0" name="03_login.png"/>
+                    <pic:cNvPicPr/>
+                  </pic:nvPicPr>
+                  <pic:blipFill>
+                    <a:blip r:embed="rId12"/>
+                    <a:stretch>
+                      <a:fillRect/>
+                    </a:stretch>
+                  </pic:blipFill>
+                  <pic:spPr>
+                    <a:xfrm>
+                      <a:off x="0" y="0"/>
+                      <a:ext cx="5669280" cy="3735250"/>
+                    </a:xfrm>
+                    <a:prstGeom prst="rect"/>
+                  </pic:spPr>
+                </pic:pic>
+              </a:graphicData>
+            </a:graphic>
+          </wp:inline>
+        </w:drawing>
       </w:r>
     </w:p>
+    <w:p/>
     <w:p>
       <w:r>
         <w:rPr>
@@ -704,12 +791,41 @@
         <w:jc w:val="center"/>
       </w:pPr>
       <w:r>
-        <w:rPr>
-          <w:i/>
-        </w:rPr>
-        <w:t>[ Paste screenshot here ]</w:t>
+        <w:drawing>
+          <wp:inline xmlns:a="http://schemas.openxmlformats.org/drawingml/2006/main" xmlns:pic="http://schemas.openxmlformats.org/drawingml/2006/picture">
+            <wp:extent cx="5669280" cy="3735250"/>
+            <wp:docPr id="5" name="Picture 5"/>
+            <wp:cNvGraphicFramePr>
+              <a:graphicFrameLocks noChangeAspect="1"/>
+            </wp:cNvGraphicFramePr>
+            <a:graphic>
+              <a:graphicData uri="http://schemas.openxmlformats.org/drawingml/2006/picture">
+                <pic:pic>
+                  <pic:nvPicPr>
+                    <pic:cNvPr id="0" name="04_item_detail.png"/>
+                    <pic:cNvPicPr/>
+                  </pic:nvPicPr>
+                  <pic:blipFill>
+                    <a:blip r:embed="rId13"/>
+                    <a:stretch>
+                      <a:fillRect/>
+                    </a:stretch>
+                  </pic:blipFill>
+                  <pic:spPr>
+                    <a:xfrm>
+                      <a:off x="0" y="0"/>
+                      <a:ext cx="5669280" cy="3735250"/>
+                    </a:xfrm>
+                    <a:prstGeom prst="rect"/>
+                  </pic:spPr>
+                </pic:pic>
+              </a:graphicData>
+            </a:graphic>
+          </wp:inline>
+        </w:drawing>
       </w:r>
     </w:p>
+    <w:p/>
     <w:p>
       <w:r>
         <w:rPr>
@@ -723,12 +839,41 @@
         <w:jc w:val="center"/>
       </w:pPr>
       <w:r>
-        <w:rPr>
-          <w:i/>
-        </w:rPr>
-        <w:t>[ Paste screenshot here ]</w:t>
+        <w:drawing>
+          <wp:inline xmlns:a="http://schemas.openxmlformats.org/drawingml/2006/main" xmlns:pic="http://schemas.openxmlformats.org/drawingml/2006/picture">
+            <wp:extent cx="5669280" cy="3735250"/>
+            <wp:docPr id="6" name="Picture 6"/>
+            <wp:cNvGraphicFramePr>
+              <a:graphicFrameLocks noChangeAspect="1"/>
+            </wp:cNvGraphicFramePr>
+            <a:graphic>
+              <a:graphicData uri="http://schemas.openxmlformats.org/drawingml/2006/picture">
+                <pic:pic>
+                  <pic:nvPicPr>
+                    <pic:cNvPr id="0" name="05_add_item.png"/>
+                    <pic:cNvPicPr/>
+                  </pic:nvPicPr>
+                  <pic:blipFill>
+                    <a:blip r:embed="rId14"/>
+                    <a:stretch>
+                      <a:fillRect/>
+                    </a:stretch>
+                  </pic:blipFill>
+                  <pic:spPr>
+                    <a:xfrm>
+                      <a:off x="0" y="0"/>
+                      <a:ext cx="5669280" cy="3735250"/>
+                    </a:xfrm>
+                    <a:prstGeom prst="rect"/>
+                  </pic:spPr>
+                </pic:pic>
+              </a:graphicData>
+            </a:graphic>
+          </wp:inline>
+        </w:drawing>
       </w:r>
     </w:p>
+    <w:p/>
     <w:p>
       <w:r>
         <w:rPr>
@@ -742,18 +887,47 @@
         <w:jc w:val="center"/>
       </w:pPr>
       <w:r>
-        <w:rPr>
-          <w:i/>
-        </w:rPr>
-        <w:t>[ Paste screenshot here ]</w:t>
+        <w:drawing>
+          <wp:inline xmlns:a="http://schemas.openxmlformats.org/drawingml/2006/main" xmlns:pic="http://schemas.openxmlformats.org/drawingml/2006/picture">
+            <wp:extent cx="5669280" cy="3735250"/>
+            <wp:docPr id="7" name="Picture 7"/>
+            <wp:cNvGraphicFramePr>
+              <a:graphicFrameLocks noChangeAspect="1"/>
+            </wp:cNvGraphicFramePr>
+            <a:graphic>
+              <a:graphicData uri="http://schemas.openxmlformats.org/drawingml/2006/picture">
+                <pic:pic>
+                  <pic:nvPicPr>
+                    <pic:cNvPr id="0" name="06_place_order.png"/>
+                    <pic:cNvPicPr/>
+                  </pic:nvPicPr>
+                  <pic:blipFill>
+                    <a:blip r:embed="rId15"/>
+                    <a:stretch>
+                      <a:fillRect/>
+                    </a:stretch>
+                  </pic:blipFill>
+                  <pic:spPr>
+                    <a:xfrm>
+                      <a:off x="0" y="0"/>
+                      <a:ext cx="5669280" cy="3735250"/>
+                    </a:xfrm>
+                    <a:prstGeom prst="rect"/>
+                  </pic:spPr>
+                </pic:pic>
+              </a:graphicData>
+            </a:graphic>
+          </wp:inline>
+        </w:drawing>
       </w:r>
     </w:p>
+    <w:p/>
     <w:p>
       <w:r>
         <w:rPr>
           <w:b/>
         </w:rPr>
-        <w:t>Screenshot 7: My Orders page (with status badges and notifications)</w:t>
+        <w:t>Screenshot 7: My Orders page (status badges and notifications)</w:t>
       </w:r>
     </w:p>
     <w:p>
@@ -761,12 +935,41 @@
         <w:jc w:val="center"/>
       </w:pPr>
       <w:r>
-        <w:rPr>
-          <w:i/>
-        </w:rPr>
-        <w:t>[ Paste screenshot here ]</w:t>
+        <w:drawing>
+          <wp:inline xmlns:a="http://schemas.openxmlformats.org/drawingml/2006/main" xmlns:pic="http://schemas.openxmlformats.org/drawingml/2006/picture">
+            <wp:extent cx="5669280" cy="3735250"/>
+            <wp:docPr id="8" name="Picture 8"/>
+            <wp:cNvGraphicFramePr>
+              <a:graphicFrameLocks noChangeAspect="1"/>
+            </wp:cNvGraphicFramePr>
+            <a:graphic>
+              <a:graphicData uri="http://schemas.openxmlformats.org/drawingml/2006/picture">
+                <pic:pic>
+                  <pic:nvPicPr>
+                    <pic:cNvPr id="0" name="07_my_orders.png"/>
+                    <pic:cNvPicPr/>
+                  </pic:nvPicPr>
+                  <pic:blipFill>
+                    <a:blip r:embed="rId16"/>
+                    <a:stretch>
+                      <a:fillRect/>
+                    </a:stretch>
+                  </pic:blipFill>
+                  <pic:spPr>
+                    <a:xfrm>
+                      <a:off x="0" y="0"/>
+                      <a:ext cx="5669280" cy="3735250"/>
+                    </a:xfrm>
+                    <a:prstGeom prst="rect"/>
+                  </pic:spPr>
+                </pic:pic>
+              </a:graphicData>
+            </a:graphic>
+          </wp:inline>
+        </w:drawing>
       </w:r>
     </w:p>
+    <w:p/>
     <w:p>
       <w:r>
         <w:rPr>
@@ -780,12 +983,41 @@
         <w:jc w:val="center"/>
       </w:pPr>
       <w:r>
-        <w:rPr>
-          <w:i/>
-        </w:rPr>
-        <w:t>[ Paste screenshot here ]</w:t>
+        <w:drawing>
+          <wp:inline xmlns:a="http://schemas.openxmlformats.org/drawingml/2006/main" xmlns:pic="http://schemas.openxmlformats.org/drawingml/2006/picture">
+            <wp:extent cx="5669280" cy="3735250"/>
+            <wp:docPr id="9" name="Picture 9"/>
+            <wp:cNvGraphicFramePr>
+              <a:graphicFrameLocks noChangeAspect="1"/>
+            </wp:cNvGraphicFramePr>
+            <a:graphic>
+              <a:graphicData uri="http://schemas.openxmlformats.org/drawingml/2006/picture">
+                <pic:pic>
+                  <pic:nvPicPr>
+                    <pic:cNvPr id="0" name="08_manage_orders.png"/>
+                    <pic:cNvPicPr/>
+                  </pic:nvPicPr>
+                  <pic:blipFill>
+                    <a:blip r:embed="rId17"/>
+                    <a:stretch>
+                      <a:fillRect/>
+                    </a:stretch>
+                  </pic:blipFill>
+                  <pic:spPr>
+                    <a:xfrm>
+                      <a:off x="0" y="0"/>
+                      <a:ext cx="5669280" cy="3735250"/>
+                    </a:xfrm>
+                    <a:prstGeom prst="rect"/>
+                  </pic:spPr>
+                </pic:pic>
+              </a:graphicData>
+            </a:graphic>
+          </wp:inline>
+        </w:drawing>
       </w:r>
     </w:p>
+    <w:p/>
     <w:p>
       <w:r>
         <w:rPr>
@@ -799,12 +1031,41 @@
         <w:jc w:val="center"/>
       </w:pPr>
       <w:r>
-        <w:rPr>
-          <w:i/>
-        </w:rPr>
-        <w:t>[ Paste screenshot here ]</w:t>
+        <w:drawing>
+          <wp:inline xmlns:a="http://schemas.openxmlformats.org/drawingml/2006/main" xmlns:pic="http://schemas.openxmlformats.org/drawingml/2006/picture">
+            <wp:extent cx="5669280" cy="4063122"/>
+            <wp:docPr id="10" name="Picture 10"/>
+            <wp:cNvGraphicFramePr>
+              <a:graphicFrameLocks noChangeAspect="1"/>
+            </wp:cNvGraphicFramePr>
+            <a:graphic>
+              <a:graphicData uri="http://schemas.openxmlformats.org/drawingml/2006/picture">
+                <pic:pic>
+                  <pic:nvPicPr>
+                    <pic:cNvPr id="0" name="09_profile.png"/>
+                    <pic:cNvPicPr/>
+                  </pic:nvPicPr>
+                  <pic:blipFill>
+                    <a:blip r:embed="rId18"/>
+                    <a:stretch>
+                      <a:fillRect/>
+                    </a:stretch>
+                  </pic:blipFill>
+                  <pic:spPr>
+                    <a:xfrm>
+                      <a:off x="0" y="0"/>
+                      <a:ext cx="5669280" cy="4063122"/>
+                    </a:xfrm>
+                    <a:prstGeom prst="rect"/>
+                  </pic:spPr>
+                </pic:pic>
+              </a:graphicData>
+            </a:graphic>
+          </wp:inline>
+        </w:drawing>
       </w:r>
     </w:p>
+    <w:p/>
     <w:p>
       <w:r>
         <w:rPr>
@@ -818,12 +1079,41 @@
         <w:jc w:val="center"/>
       </w:pPr>
       <w:r>
-        <w:rPr>
-          <w:i/>
-        </w:rPr>
-        <w:t>[ Paste screenshot here ]</w:t>
+        <w:drawing>
+          <wp:inline xmlns:a="http://schemas.openxmlformats.org/drawingml/2006/main" xmlns:pic="http://schemas.openxmlformats.org/drawingml/2006/picture">
+            <wp:extent cx="5669280" cy="3735250"/>
+            <wp:docPr id="11" name="Picture 11"/>
+            <wp:cNvGraphicFramePr>
+              <a:graphicFrameLocks noChangeAspect="1"/>
+            </wp:cNvGraphicFramePr>
+            <a:graphic>
+              <a:graphicData uri="http://schemas.openxmlformats.org/drawingml/2006/picture">
+                <pic:pic>
+                  <pic:nvPicPr>
+                    <pic:cNvPr id="0" name="10_admin.png"/>
+                    <pic:cNvPicPr/>
+                  </pic:nvPicPr>
+                  <pic:blipFill>
+                    <a:blip r:embed="rId19"/>
+                    <a:stretch>
+                      <a:fillRect/>
+                    </a:stretch>
+                  </pic:blipFill>
+                  <pic:spPr>
+                    <a:xfrm>
+                      <a:off x="0" y="0"/>
+                      <a:ext cx="5669280" cy="3735250"/>
+                    </a:xfrm>
+                    <a:prstGeom prst="rect"/>
+                  </pic:spPr>
+                </pic:pic>
+              </a:graphicData>
+            </a:graphic>
+          </wp:inline>
+        </w:drawing>
       </w:r>
     </w:p>
+    <w:p/>
     <w:p>
       <w:r>
         <w:rPr>
@@ -837,12 +1127,41 @@
         <w:jc w:val="center"/>
       </w:pPr>
       <w:r>
-        <w:rPr>
-          <w:i/>
-        </w:rPr>
-        <w:t>[ Paste screenshot here ]</w:t>
+        <w:drawing>
+          <wp:inline xmlns:a="http://schemas.openxmlformats.org/drawingml/2006/main" xmlns:pic="http://schemas.openxmlformats.org/drawingml/2006/picture">
+            <wp:extent cx="5669280" cy="4610959"/>
+            <wp:docPr id="12" name="Picture 12"/>
+            <wp:cNvGraphicFramePr>
+              <a:graphicFrameLocks noChangeAspect="1"/>
+            </wp:cNvGraphicFramePr>
+            <a:graphic>
+              <a:graphicData uri="http://schemas.openxmlformats.org/drawingml/2006/picture">
+                <pic:pic>
+                  <pic:nvPicPr>
+                    <pic:cNvPr id="0" name="11_api.png"/>
+                    <pic:cNvPicPr/>
+                  </pic:nvPicPr>
+                  <pic:blipFill>
+                    <a:blip r:embed="rId20"/>
+                    <a:stretch>
+                      <a:fillRect/>
+                    </a:stretch>
+                  </pic:blipFill>
+                  <pic:spPr>
+                    <a:xfrm>
+                      <a:off x="0" y="0"/>
+                      <a:ext cx="5669280" cy="4610959"/>
+                    </a:xfrm>
+                    <a:prstGeom prst="rect"/>
+                  </pic:spPr>
+                </pic:pic>
+              </a:graphicData>
+            </a:graphic>
+          </wp:inline>
+        </w:drawing>
       </w:r>
     </w:p>
+    <w:p/>
     <w:p>
       <w:pPr>
         <w:pStyle w:val="Heading1"/>

</xml_diff>